<commit_message>
TS 3.3-3.5 Jatai Ghanam Final
</commit_message>
<xml_diff>
--- a/TS Jatai Ghanam Project/TS 3.5/TS 3.5 Ghanam Tamil Corrections.docx
+++ b/TS Jatai Ghanam Project/TS 3.5/TS 3.5 Ghanam Tamil Corrections.docx
@@ -199,8 +199,39 @@
                 <w:bCs/>
                 <w:szCs w:val="40"/>
               </w:rPr>
-              <w:t>None                      None                               None</w:t>
-            </w:r>
+              <w:t xml:space="preserve">None                      </w:t>
+            </w:r>
+            <w:proofErr w:type="spellStart"/>
+            <w:r>
+              <w:rPr>
+                <w:rFonts w:cs="BRH Malayalam Extra"/>
+                <w:b/>
+                <w:bCs/>
+                <w:szCs w:val="40"/>
+              </w:rPr>
+              <w:t>None</w:t>
+            </w:r>
+            <w:proofErr w:type="spellEnd"/>
+            <w:r>
+              <w:rPr>
+                <w:rFonts w:cs="BRH Malayalam Extra"/>
+                <w:b/>
+                <w:bCs/>
+                <w:szCs w:val="40"/>
+              </w:rPr>
+              <w:t xml:space="preserve">                               </w:t>
+            </w:r>
+            <w:proofErr w:type="spellStart"/>
+            <w:r>
+              <w:rPr>
+                <w:rFonts w:cs="BRH Malayalam Extra"/>
+                <w:b/>
+                <w:bCs/>
+                <w:szCs w:val="40"/>
+              </w:rPr>
+              <w:t>None</w:t>
+            </w:r>
+            <w:proofErr w:type="spellEnd"/>
           </w:p>
         </w:tc>
         <w:tc>
@@ -231,8 +262,39 @@
                 <w:bCs/>
                 <w:szCs w:val="40"/>
               </w:rPr>
-              <w:t>None                      None                               None</w:t>
-            </w:r>
+              <w:t xml:space="preserve">None                      </w:t>
+            </w:r>
+            <w:proofErr w:type="spellStart"/>
+            <w:r>
+              <w:rPr>
+                <w:rFonts w:cs="BRH Malayalam Extra"/>
+                <w:b/>
+                <w:bCs/>
+                <w:szCs w:val="40"/>
+              </w:rPr>
+              <w:t>None</w:t>
+            </w:r>
+            <w:proofErr w:type="spellEnd"/>
+            <w:r>
+              <w:rPr>
+                <w:rFonts w:cs="BRH Malayalam Extra"/>
+                <w:b/>
+                <w:bCs/>
+                <w:szCs w:val="40"/>
+              </w:rPr>
+              <w:t xml:space="preserve">                               </w:t>
+            </w:r>
+            <w:proofErr w:type="spellStart"/>
+            <w:r>
+              <w:rPr>
+                <w:rFonts w:cs="BRH Malayalam Extra"/>
+                <w:b/>
+                <w:bCs/>
+                <w:szCs w:val="40"/>
+              </w:rPr>
+              <w:t>None</w:t>
+            </w:r>
+            <w:proofErr w:type="spellEnd"/>
           </w:p>
         </w:tc>
       </w:tr>
@@ -19544,6 +19606,7 @@
                 <w:cs/>
                 <w:lang w:bidi="ta-IN"/>
               </w:rPr>
+              <w:lastRenderedPageBreak/>
               <w:t>40</w:t>
             </w:r>
             <w:r>
@@ -20006,17 +20069,7 @@
                 <w:cs/>
                 <w:lang w:bidi="ta-IN"/>
               </w:rPr>
-              <w:t xml:space="preserve">மே </w:t>
-            </w:r>
-            <w:r>
-              <w:rPr>
-                <w:rFonts w:ascii="Latha" w:hAnsi="Latha" w:cs="Latha"/>
-                <w:szCs w:val="24"/>
-                <w:cs/>
-                <w:lang w:bidi="ta-IN"/>
-              </w:rPr>
-              <w:lastRenderedPageBreak/>
-              <w:t>நோ</w:t>
+              <w:t>மே நோ</w:t>
             </w:r>
             <w:r>
               <w:rPr>
@@ -21580,7 +21633,6 @@
                 <w:cs/>
                 <w:lang w:bidi="ta-IN"/>
               </w:rPr>
-              <w:lastRenderedPageBreak/>
               <w:t>40</w:t>
             </w:r>
             <w:r>
@@ -22129,7 +22181,6 @@
                 <w:cs/>
                 <w:lang w:bidi="ta-IN"/>
               </w:rPr>
-              <w:lastRenderedPageBreak/>
               <w:t>ஹ</w:t>
             </w:r>
             <w:r>
@@ -23596,7 +23647,6 @@
                 <w:cs/>
                 <w:lang w:bidi="ta-IN"/>
               </w:rPr>
-              <w:lastRenderedPageBreak/>
               <w:t>22)</w:t>
             </w:r>
             <w:r>
@@ -25307,6 +25357,7 @@
                 <w:cs/>
                 <w:lang w:bidi="ta-IN"/>
               </w:rPr>
+              <w:lastRenderedPageBreak/>
               <w:t>28</w:t>
             </w:r>
             <w:r>
@@ -25931,17 +25982,7 @@
                 <w:cs/>
                 <w:lang w:bidi="ta-IN"/>
               </w:rPr>
-              <w:t xml:space="preserve">ம் </w:t>
-            </w:r>
-            <w:r>
-              <w:rPr>
-                <w:rFonts w:ascii="Latha" w:hAnsi="Latha" w:cs="Latha"/>
-                <w:szCs w:val="24"/>
-                <w:cs/>
-                <w:lang w:bidi="ta-IN"/>
-              </w:rPr>
-              <w:lastRenderedPageBreak/>
-              <w:t>மத்</w:t>
+              <w:t>ம் மத்</w:t>
             </w:r>
             <w:r>
               <w:rPr>
@@ -28114,6 +28155,7 @@
                 <w:cs/>
                 <w:lang w:bidi="ta-IN"/>
               </w:rPr>
+              <w:lastRenderedPageBreak/>
               <w:t>30</w:t>
             </w:r>
             <w:r>
@@ -28416,7 +28458,6 @@
                 <w:cs/>
                 <w:lang w:bidi="ta-IN"/>
               </w:rPr>
-              <w:lastRenderedPageBreak/>
               <w:t>ரு</w:t>
             </w:r>
             <w:r>
@@ -30353,17 +30394,7 @@
                 <w:cs/>
                 <w:lang w:bidi="ta-IN"/>
               </w:rPr>
-              <w:t xml:space="preserve">ம் </w:t>
-            </w:r>
-            <w:r>
-              <w:rPr>
-                <w:rFonts w:ascii="Latha" w:hAnsi="Latha" w:cs="Latha"/>
-                <w:szCs w:val="24"/>
-                <w:cs/>
-                <w:lang w:bidi="ta-IN"/>
-              </w:rPr>
-              <w:lastRenderedPageBreak/>
-              <w:t>த</w:t>
+              <w:t>ம் த</w:t>
             </w:r>
             <w:r>
               <w:rPr>
@@ -32365,6 +32396,7 @@
                 <w:cs/>
                 <w:lang w:bidi="ta-IN"/>
               </w:rPr>
+              <w:lastRenderedPageBreak/>
               <w:t>30</w:t>
             </w:r>
             <w:r>
@@ -33323,7 +33355,6 @@
                 <w:cs/>
                 <w:lang w:bidi="ta-IN"/>
               </w:rPr>
-              <w:lastRenderedPageBreak/>
               <w:t>31</w:t>
             </w:r>
             <w:r>
@@ -35182,6 +35213,7 @@
                 <w:cs/>
                 <w:lang w:bidi="ta-IN"/>
               </w:rPr>
+              <w:lastRenderedPageBreak/>
               <w:t>26</w:t>
             </w:r>
             <w:r>
@@ -35593,17 +35625,7 @@
                 <w:cs/>
                 <w:lang w:bidi="ta-IN"/>
               </w:rPr>
-              <w:t xml:space="preserve"> ஸா </w:t>
-            </w:r>
-            <w:r>
-              <w:rPr>
-                <w:rFonts w:ascii="Latha" w:hAnsi="Latha" w:cs="Latha"/>
-                <w:szCs w:val="24"/>
-                <w:cs/>
-                <w:lang w:bidi="ta-IN"/>
-              </w:rPr>
-              <w:lastRenderedPageBreak/>
-              <w:t>யத்ர</w:t>
+              <w:t xml:space="preserve"> ஸா யத்ர</w:t>
             </w:r>
             <w:r>
               <w:rPr>
@@ -37186,6 +37208,7 @@
                 <w:cs/>
                 <w:lang w:bidi="ta-IN"/>
               </w:rPr>
+              <w:lastRenderedPageBreak/>
               <w:t>26</w:t>
             </w:r>
             <w:r>
@@ -37601,17 +37624,7 @@
                 <w:cs/>
                 <w:lang w:bidi="ta-IN"/>
               </w:rPr>
-              <w:t xml:space="preserve"> ஸா </w:t>
-            </w:r>
-            <w:r>
-              <w:rPr>
-                <w:rFonts w:ascii="Latha" w:hAnsi="Latha" w:cs="Latha"/>
-                <w:szCs w:val="24"/>
-                <w:cs/>
-                <w:lang w:bidi="ta-IN"/>
-              </w:rPr>
-              <w:lastRenderedPageBreak/>
-              <w:t>யத்ர</w:t>
+              <w:t xml:space="preserve"> ஸா யத்ர</w:t>
             </w:r>
             <w:r>
               <w:rPr>
@@ -38259,6 +38272,8 @@
       <w:headerReference w:type="default" r:id="rId8"/>
       <w:footerReference w:type="even" r:id="rId9"/>
       <w:footerReference w:type="default" r:id="rId10"/>
+      <w:headerReference w:type="first" r:id="rId11"/>
+      <w:footerReference w:type="first" r:id="rId12"/>
       <w:pgSz w:w="15840" w:h="12240" w:orient="landscape"/>
       <w:pgMar w:top="1440" w:right="1440" w:bottom="1440" w:left="1440" w:header="720" w:footer="720" w:gutter="0"/>
       <w:cols w:space="720"/>
@@ -38347,6 +38362,19 @@
         <w:bCs/>
       </w:rPr>
       <w:tab/>
+    </w:r>
+    <w:r>
+      <w:rPr>
+        <w:b/>
+        <w:bCs/>
+      </w:rPr>
+      <w:t>www.</w:t>
+    </w:r>
+    <w:r>
+      <w:rPr>
+        <w:b/>
+        <w:bCs/>
+      </w:rPr>
       <w:t>v</w:t>
     </w:r>
     <w:r>
@@ -38354,7 +38382,14 @@
         <w:b/>
         <w:bCs/>
       </w:rPr>
-      <w:t>edavms@gmail.com</w:t>
+      <w:t>edavms</w:t>
+    </w:r>
+    <w:r>
+      <w:rPr>
+        <w:b/>
+        <w:bCs/>
+      </w:rPr>
+      <w:t>.in</w:t>
     </w:r>
     <w:r>
       <w:rPr>
@@ -38362,6 +38397,13 @@
         <w:bCs/>
       </w:rPr>
       <w:tab/>
+    </w:r>
+    <w:r>
+      <w:rPr>
+        <w:b/>
+        <w:bCs/>
+      </w:rPr>
+      <w:t xml:space="preserve">                       </w:t>
     </w:r>
     <w:r>
       <w:rPr>
@@ -38681,6 +38723,16 @@
 </w:ftr>
 </file>
 
+<file path=word/footer3.xml><?xml version="1.0" encoding="utf-8"?>
+<w:ftr xmlns:wpc="http://schemas.microsoft.com/office/word/2010/wordprocessingCanvas" xmlns:cx="http://schemas.microsoft.com/office/drawing/2014/chartex" xmlns:cx1="http://schemas.microsoft.com/office/drawing/2015/9/8/chartex" xmlns:cx2="http://schemas.microsoft.com/office/drawing/2015/10/21/chartex" xmlns:cx3="http://schemas.microsoft.com/office/drawing/2016/5/9/chartex" xmlns:cx4="http://schemas.microsoft.com/office/drawing/2016/5/10/chartex" xmlns:cx5="http://schemas.microsoft.com/office/drawing/2016/5/11/chartex" xmlns:cx6="http://schemas.microsoft.com/office/drawing/2016/5/12/chartex" xmlns:cx7="http://schemas.microsoft.com/office/drawing/2016/5/13/chartex" xmlns:cx8="http://schemas.microsoft.com/office/drawing/2016/5/14/chartex" xmlns:mc="http://schemas.openxmlformats.org/markup-compatibility/2006" xmlns:aink="http://schemas.microsoft.com/office/drawing/2016/ink" xmlns:am3d="http://schemas.microsoft.com/office/drawing/2017/model3d" xmlns:o="urn:schemas-microsoft-com:office:office" xmlns:oel="http://schemas.microsoft.com/office/2019/extlst" xmlns:r="http://schemas.openxmlformats.org/officeDocument/2006/relationships" xmlns:m="http://schemas.openxmlformats.org/officeDocument/2006/math" xmlns:v="urn:schemas-microsoft-com:vml" xmlns:wp14="http://schemas.microsoft.com/office/word/2010/wordprocessingDrawing" xmlns:wp="http://schemas.openxmlformats.org/drawingml/2006/wordprocessingDrawing" xmlns:w10="urn:schemas-microsoft-com:office:word" xmlns:w="http://schemas.openxmlformats.org/wordprocessingml/2006/main" xmlns:w14="http://schemas.microsoft.com/office/word/2010/wordml" xmlns:w15="http://schemas.microsoft.com/office/word/2012/wordml" xmlns:w16cex="http://schemas.microsoft.com/office/word/2018/wordml/cex" xmlns:w16cid="http://schemas.microsoft.com/office/word/2016/wordml/cid" xmlns:w16="http://schemas.microsoft.com/office/word/2018/wordml" xmlns:w16du="http://schemas.microsoft.com/office/word/2023/wordml/word16du" xmlns:w16sdtdh="http://schemas.microsoft.com/office/word/2020/wordml/sdtdatahash" xmlns:w16sdtfl="http://schemas.microsoft.com/office/word/2024/wordml/sdtformatlock" xmlns:w16se="http://schemas.microsoft.com/office/word/2015/wordml/symex" xmlns:wpg="http://schemas.microsoft.com/office/word/2010/wordprocessingGroup" xmlns:wpi="http://schemas.microsoft.com/office/word/2010/wordprocessingInk" xmlns:wne="http://schemas.microsoft.com/office/word/2006/wordml" xmlns:wps="http://schemas.microsoft.com/office/word/2010/wordprocessingShape" mc:Ignorable="w14 w15 w16se w16cid w16 w16cex w16sdtdh w16sdtfl w16du wp14">
+  <w:p>
+    <w:pPr>
+      <w:pStyle w:val="Footer"/>
+    </w:pPr>
+  </w:p>
+</w:ftr>
+</file>
+
 <file path=word/footnotes.xml><?xml version="1.0" encoding="utf-8"?>
 <w:footnotes xmlns:wpc="http://schemas.microsoft.com/office/word/2010/wordprocessingCanvas" xmlns:cx="http://schemas.microsoft.com/office/drawing/2014/chartex" xmlns:cx1="http://schemas.microsoft.com/office/drawing/2015/9/8/chartex" xmlns:cx2="http://schemas.microsoft.com/office/drawing/2015/10/21/chartex" xmlns:cx3="http://schemas.microsoft.com/office/drawing/2016/5/9/chartex" xmlns:cx4="http://schemas.microsoft.com/office/drawing/2016/5/10/chartex" xmlns:cx5="http://schemas.microsoft.com/office/drawing/2016/5/11/chartex" xmlns:cx6="http://schemas.microsoft.com/office/drawing/2016/5/12/chartex" xmlns:cx7="http://schemas.microsoft.com/office/drawing/2016/5/13/chartex" xmlns:cx8="http://schemas.microsoft.com/office/drawing/2016/5/14/chartex" xmlns:mc="http://schemas.openxmlformats.org/markup-compatibility/2006" xmlns:aink="http://schemas.microsoft.com/office/drawing/2016/ink" xmlns:am3d="http://schemas.microsoft.com/office/drawing/2017/model3d" xmlns:o="urn:schemas-microsoft-com:office:office" xmlns:oel="http://schemas.microsoft.com/office/2019/extlst" xmlns:r="http://schemas.openxmlformats.org/officeDocument/2006/relationships" xmlns:m="http://schemas.openxmlformats.org/officeDocument/2006/math" xmlns:v="urn:schemas-microsoft-com:vml" xmlns:wp14="http://schemas.microsoft.com/office/word/2010/wordprocessingDrawing" xmlns:wp="http://schemas.openxmlformats.org/drawingml/2006/wordprocessingDrawing" xmlns:w10="urn:schemas-microsoft-com:office:word" xmlns:w="http://schemas.openxmlformats.org/wordprocessingml/2006/main" xmlns:w14="http://schemas.microsoft.com/office/word/2010/wordml" xmlns:w15="http://schemas.microsoft.com/office/word/2012/wordml" xmlns:w16cex="http://schemas.microsoft.com/office/word/2018/wordml/cex" xmlns:w16cid="http://schemas.microsoft.com/office/word/2016/wordml/cid" xmlns:w16="http://schemas.microsoft.com/office/word/2018/wordml" xmlns:w16du="http://schemas.microsoft.com/office/word/2023/wordml/word16du" xmlns:w16sdtdh="http://schemas.microsoft.com/office/word/2020/wordml/sdtdatahash" xmlns:w16sdtfl="http://schemas.microsoft.com/office/word/2024/wordml/sdtformatlock" xmlns:w16se="http://schemas.microsoft.com/office/word/2015/wordml/symex" xmlns:wpg="http://schemas.microsoft.com/office/word/2010/wordprocessingGroup" xmlns:wpi="http://schemas.microsoft.com/office/word/2010/wordprocessingInk" xmlns:wne="http://schemas.microsoft.com/office/word/2006/wordml" xmlns:wps="http://schemas.microsoft.com/office/word/2010/wordprocessingShape" mc:Ignorable="w14 w15 w16se w16cid w16 w16cex w16sdtdh w16sdtfl w16du wp14">
   <w:footnote w:type="separator" w:id="-1">
@@ -38735,6 +38787,16 @@
       <w:pBdr>
         <w:bottom w:val="single" w:sz="4" w:space="1" w:color="auto"/>
       </w:pBdr>
+    </w:pPr>
+  </w:p>
+</w:hdr>
+</file>
+
+<file path=word/header3.xml><?xml version="1.0" encoding="utf-8"?>
+<w:hdr xmlns:wpc="http://schemas.microsoft.com/office/word/2010/wordprocessingCanvas" xmlns:cx="http://schemas.microsoft.com/office/drawing/2014/chartex" xmlns:cx1="http://schemas.microsoft.com/office/drawing/2015/9/8/chartex" xmlns:cx2="http://schemas.microsoft.com/office/drawing/2015/10/21/chartex" xmlns:cx3="http://schemas.microsoft.com/office/drawing/2016/5/9/chartex" xmlns:cx4="http://schemas.microsoft.com/office/drawing/2016/5/10/chartex" xmlns:cx5="http://schemas.microsoft.com/office/drawing/2016/5/11/chartex" xmlns:cx6="http://schemas.microsoft.com/office/drawing/2016/5/12/chartex" xmlns:cx7="http://schemas.microsoft.com/office/drawing/2016/5/13/chartex" xmlns:cx8="http://schemas.microsoft.com/office/drawing/2016/5/14/chartex" xmlns:mc="http://schemas.openxmlformats.org/markup-compatibility/2006" xmlns:aink="http://schemas.microsoft.com/office/drawing/2016/ink" xmlns:am3d="http://schemas.microsoft.com/office/drawing/2017/model3d" xmlns:o="urn:schemas-microsoft-com:office:office" xmlns:oel="http://schemas.microsoft.com/office/2019/extlst" xmlns:r="http://schemas.openxmlformats.org/officeDocument/2006/relationships" xmlns:m="http://schemas.openxmlformats.org/officeDocument/2006/math" xmlns:v="urn:schemas-microsoft-com:vml" xmlns:wp14="http://schemas.microsoft.com/office/word/2010/wordprocessingDrawing" xmlns:wp="http://schemas.openxmlformats.org/drawingml/2006/wordprocessingDrawing" xmlns:w10="urn:schemas-microsoft-com:office:word" xmlns:w="http://schemas.openxmlformats.org/wordprocessingml/2006/main" xmlns:w14="http://schemas.microsoft.com/office/word/2010/wordml" xmlns:w15="http://schemas.microsoft.com/office/word/2012/wordml" xmlns:w16cex="http://schemas.microsoft.com/office/word/2018/wordml/cex" xmlns:w16cid="http://schemas.microsoft.com/office/word/2016/wordml/cid" xmlns:w16="http://schemas.microsoft.com/office/word/2018/wordml" xmlns:w16du="http://schemas.microsoft.com/office/word/2023/wordml/word16du" xmlns:w16sdtdh="http://schemas.microsoft.com/office/word/2020/wordml/sdtdatahash" xmlns:w16sdtfl="http://schemas.microsoft.com/office/word/2024/wordml/sdtformatlock" xmlns:w16se="http://schemas.microsoft.com/office/word/2015/wordml/symex" xmlns:wpg="http://schemas.microsoft.com/office/word/2010/wordprocessingGroup" xmlns:wpi="http://schemas.microsoft.com/office/word/2010/wordprocessingInk" xmlns:wne="http://schemas.microsoft.com/office/word/2006/wordml" xmlns:wps="http://schemas.microsoft.com/office/word/2010/wordprocessingShape" mc:Ignorable="w14 w15 w16se w16cid w16 w16cex w16sdtdh w16sdtfl w16du wp14">
+  <w:p>
+    <w:pPr>
+      <w:pStyle w:val="Header"/>
     </w:pPr>
   </w:p>
 </w:hdr>

</xml_diff>